<commit_message>
feat: embed profile portrait in ATS resume, update location to Puchong, and sync across portfolio
</commit_message>
<xml_diff>
--- a/Resume ATS Muhammed Munir final.docx
+++ b/Resume ATS Muhammed Munir final.docx
@@ -2,59 +2,129 @@
 <file path=word/document.xml><?xml version="1.0" encoding="utf-8"?>
 <w:document xmlns:wpc="http://schemas.microsoft.com/office/word/2010/wordprocessingCanvas" xmlns:mo="http://schemas.microsoft.com/office/mac/office/2008/main" xmlns:mc="http://schemas.openxmlformats.org/markup-compatibility/2006" xmlns:mv="urn:schemas-microsoft-com:mac:vml" xmlns:o="urn:schemas-microsoft-com:office:office" xmlns:r="http://schemas.openxmlformats.org/officeDocument/2006/relationships" xmlns:m="http://schemas.openxmlformats.org/officeDocument/2006/math" xmlns:v="urn:schemas-microsoft-com:vml" xmlns:wp14="http://schemas.microsoft.com/office/word/2010/wordprocessingDrawing" xmlns:wp="http://schemas.openxmlformats.org/drawingml/2006/wordprocessingDrawing" xmlns:w10="urn:schemas-microsoft-com:office:word" xmlns:w="http://schemas.openxmlformats.org/wordprocessingml/2006/main" xmlns:w14="http://schemas.microsoft.com/office/word/2010/wordml" xmlns:wpg="http://schemas.microsoft.com/office/word/2010/wordprocessingGroup" xmlns:wpi="http://schemas.microsoft.com/office/word/2010/wordprocessingInk" xmlns:wne="http://schemas.microsoft.com/office/word/2006/wordml" xmlns:wps="http://schemas.microsoft.com/office/word/2010/wordprocessingShape" mc:Ignorable="w14 wp14">
   <w:body>
+    <w:tbl>
+      <w:tblPr>
+        <w:tblW w:type="auto" w:w="0"/>
+        <w:jc w:val="center"/>
+        <w:tblLayout w:type="fixed"/>
+        <w:tblLook w:firstColumn="1" w:firstRow="1" w:lastColumn="0" w:lastRow="0" w:noHBand="0" w:noVBand="1" w:val="04A0"/>
+      </w:tblPr>
+      <w:tblGrid>
+        <w:gridCol w:w="1656"/>
+        <w:gridCol w:w="8813"/>
+      </w:tblGrid>
+      <w:tr>
+        <w:tc>
+          <w:tcPr>
+            <w:tcW w:type="dxa" w:w="5234"/>
+            <w:tcMar>
+              <w:top w:w="0" w:type="dxa"/>
+              <w:bottom w:w="20" w:type="dxa"/>
+              <w:left w:w="0" w:type="dxa"/>
+              <w:right w:w="100" w:type="dxa"/>
+            </w:tcMar>
+          </w:tcPr>
+          <w:p>
+            <w:pPr>
+              <w:spacing w:before="0" w:after="0"/>
+              <w:jc w:val="left"/>
+            </w:pPr>
+            <w:r>
+              <w:drawing>
+                <wp:inline xmlns:a="http://schemas.openxmlformats.org/drawingml/2006/main" xmlns:pic="http://schemas.openxmlformats.org/drawingml/2006/picture">
+                  <wp:extent cx="868680" cy="1115568"/>
+                  <wp:docPr id="1" name="Picture 1"/>
+                  <wp:cNvGraphicFramePr>
+                    <a:graphicFrameLocks noChangeAspect="1"/>
+                  </wp:cNvGraphicFramePr>
+                  <a:graphic>
+                    <a:graphicData uri="http://schemas.openxmlformats.org/drawingml/2006/picture">
+                      <pic:pic>
+                        <pic:nvPicPr>
+                          <pic:cNvPr id="0" name="profile_photo.jpg"/>
+                          <pic:cNvPicPr/>
+                        </pic:nvPicPr>
+                        <pic:blipFill>
+                          <a:blip r:embed="rId9"/>
+                          <a:stretch>
+                            <a:fillRect/>
+                          </a:stretch>
+                        </pic:blipFill>
+                        <pic:spPr>
+                          <a:xfrm>
+                            <a:off x="0" y="0"/>
+                            <a:ext cx="868680" cy="1115568"/>
+                          </a:xfrm>
+                          <a:prstGeom prst="rect"/>
+                        </pic:spPr>
+                      </pic:pic>
+                    </a:graphicData>
+                  </a:graphic>
+                </wp:inline>
+              </w:drawing>
+            </w:r>
+          </w:p>
+        </w:tc>
+        <w:tc>
+          <w:tcPr>
+            <w:tcW w:type="dxa" w:w="5234"/>
+            <w:tcMar>
+              <w:top w:w="0" w:type="dxa"/>
+              <w:bottom w:w="20" w:type="dxa"/>
+              <w:left w:w="50" w:type="dxa"/>
+              <w:right w:w="0" w:type="dxa"/>
+            </w:tcMar>
+          </w:tcPr>
+          <w:p>
+            <w:pPr>
+              <w:spacing w:before="0" w:after="20"/>
+            </w:pPr>
+            <w:r>
+              <w:rPr>
+                <w:rFonts w:ascii="Calibri" w:hAnsi="Calibri"/>
+                <w:b/>
+                <w:color w:val="0F172A"/>
+                <w:sz w:val="34"/>
+              </w:rPr>
+              <w:t>MUHAMMED MUNIR BIN MOHD AZMI</w:t>
+              <w:br/>
+            </w:r>
+            <w:r>
+              <w:rPr>
+                <w:rFonts w:ascii="Calibri" w:hAnsi="Calibri"/>
+                <w:b/>
+                <w:color w:val="1D4ED8"/>
+                <w:sz w:val="19"/>
+              </w:rPr>
+              <w:t>Full-Stack Systems Engineer &amp; IT Professional • Network Security (UTM)</w:t>
+              <w:br/>
+            </w:r>
+            <w:r>
+              <w:rPr>
+                <w:rFonts w:ascii="Calibri" w:hAnsi="Calibri"/>
+                <w:color w:val="334155"/>
+                <w:sz w:val="16"/>
+              </w:rPr>
+              <w:t>📍 Puchong, Selangor   |   📞 +60 13-563 6124   |   ✉️ muhammed.munir97.mm@gmail.com</w:t>
+              <w:br/>
+              <w:t>🌐 Portfolio: https://muhammedmunir.github.io/   |   🔗 LinkedIn: linkedin.com/in/muhammed-munir-bin-mohd-azmi-9b233b271   |   💻 GitHub: github.com/muhammedmunir</w:t>
+            </w:r>
+          </w:p>
+        </w:tc>
+      </w:tr>
+    </w:tbl>
     <w:p>
       <w:pPr>
-        <w:spacing w:before="0" w:after="20"/>
-        <w:jc w:val="center"/>
-      </w:pPr>
-      <w:r>
-        <w:rPr>
-          <w:rFonts w:ascii="Calibri" w:hAnsi="Calibri"/>
-          <w:b/>
-          <w:color w:val="0F172A"/>
-          <w:sz w:val="36"/>
-        </w:rPr>
-        <w:t>MUHAMMED MUNIR BIN MOHD AZMI</w:t>
-      </w:r>
-    </w:p>
-    <w:p>
-      <w:pPr>
-        <w:spacing w:before="0" w:after="60"/>
-        <w:jc w:val="center"/>
-      </w:pPr>
-      <w:r>
-        <w:rPr>
-          <w:rFonts w:ascii="Calibri" w:hAnsi="Calibri"/>
-          <w:b/>
-          <w:color w:val="1D4ED8"/>
-          <w:sz w:val="20"/>
-        </w:rPr>
-        <w:t>Full-Stack Systems Engineer &amp; IT Professional • Network Security (UTM)</w:t>
-      </w:r>
-    </w:p>
-    <w:p>
-      <w:pPr>
-        <w:spacing w:before="0" w:after="100"/>
-        <w:jc w:val="center"/>
+        <w:spacing w:before="40" w:after="40"/>
         <w:pBdr>
           <w:bottom w:val="single" w:sz="12" w:space="4" w:color="CBD5E1"/>
         </w:pBdr>
       </w:pPr>
-      <w:r>
-        <w:rPr>
-          <w:rFonts w:ascii="Calibri" w:hAnsi="Calibri"/>
-          <w:color w:val="334155"/>
-          <w:sz w:val="17"/>
-        </w:rPr>
-        <w:t>Bandar Puteri, Puchong, Selangor   |   +60 13-563 6124   |   muhammed.munir97.mm@gmail.com</w:t>
-        <w:br/>
-        <w:t>Portfolio: https://muhammedmunir.github.io/   |   LinkedIn: linkedin.com/in/muhammed-munir-bin-mohd-azmi-9b233b271   |   GitHub: github.com/muhammedmunir</w:t>
-      </w:r>
     </w:p>
     <w:p>
       <w:pPr>
         <w:keepNext/>
-        <w:spacing w:before="120" w:after="60"/>
+        <w:spacing w:before="100" w:after="50"/>
         <w:pBdr>
           <w:bottom w:val="single" w:sz="12" w:space="4" w:color="CBD5E1"/>
         </w:pBdr>
@@ -71,13 +141,13 @@
     </w:p>
     <w:p>
       <w:pPr>
-        <w:spacing w:before="40" w:after="80" w:line="276" w:lineRule="auto"/>
+        <w:spacing w:before="40" w:after="60" w:line="276" w:lineRule="auto"/>
       </w:pPr>
       <w:r>
         <w:rPr>
           <w:rFonts w:ascii="Calibri" w:hAnsi="Calibri"/>
           <w:color w:val="334155"/>
-          <w:sz w:val="18"/>
+          <w:sz w:val="17"/>
         </w:rPr>
         <w:t>Versatile, security-conscious Full-Stack Systems Engineer with proven experience developing and maintaining high-reliability enterprise platforms, public sector asset management systems, and AI-driven automation applications. Highly skilled in Vue.js 3, Laravel 11/12 (Filament), SvelteKit, Flutter, Docker Swarm, and Python Computer Vision, backed by an academic background in Computer Science (Network Security) from UTM, industry Cisco networking certifications, and hands-on Security Operations Center (SOC) threat defense experience at Tenaga Nasional Berhad (TNB).</w:t>
       </w:r>
@@ -85,7 +155,7 @@
     <w:p>
       <w:pPr>
         <w:keepNext/>
-        <w:spacing w:before="120" w:after="60"/>
+        <w:spacing w:before="100" w:after="50"/>
         <w:pBdr>
           <w:bottom w:val="single" w:sz="12" w:space="4" w:color="CBD5E1"/>
         </w:pBdr>
@@ -116,15 +186,15 @@
           <w:tcPr>
             <w:tcW w:type="dxa" w:w="5234"/>
             <w:tcMar>
-              <w:top w:w="20" w:type="dxa"/>
-              <w:bottom w:w="10" w:type="dxa"/>
+              <w:top w:w="15" w:type="dxa"/>
+              <w:bottom w:w="8" w:type="dxa"/>
               <w:left w:w="0" w:type="dxa"/>
               <w:right w:w="0" w:type="dxa"/>
             </w:tcMar>
           </w:tcPr>
           <w:p>
             <w:pPr>
-              <w:spacing w:before="40" w:after="0" w:line="276" w:lineRule="auto"/>
+              <w:spacing w:before="30" w:after="0" w:line="276" w:lineRule="auto"/>
             </w:pPr>
             <w:r>
               <w:rPr>
@@ -150,15 +220,15 @@
           <w:tcPr>
             <w:tcW w:type="dxa" w:w="5234"/>
             <w:tcMar>
-              <w:top w:w="20" w:type="dxa"/>
-              <w:bottom w:w="10" w:type="dxa"/>
+              <w:top w:w="15" w:type="dxa"/>
+              <w:bottom w:w="8" w:type="dxa"/>
               <w:left w:w="0" w:type="dxa"/>
               <w:right w:w="0" w:type="dxa"/>
             </w:tcMar>
           </w:tcPr>
           <w:p>
             <w:pPr>
-              <w:spacing w:before="40" w:after="0" w:line="276" w:lineRule="auto"/>
+              <w:spacing w:before="30" w:after="0" w:line="276" w:lineRule="auto"/>
               <w:jc w:val="right"/>
             </w:pPr>
             <w:r>
@@ -191,7 +261,7 @@
     <w:p>
       <w:pPr>
         <w:spacing w:before="0" w:after="30" w:line="276" w:lineRule="auto"/>
-        <w:ind w:left="288"/>
+        <w:ind w:left="259"/>
       </w:pPr>
       <w:r>
         <w:rPr>
@@ -222,7 +292,7 @@
     <w:p>
       <w:pPr>
         <w:spacing w:before="0" w:after="30" w:line="276" w:lineRule="auto"/>
-        <w:ind w:left="288"/>
+        <w:ind w:left="259"/>
       </w:pPr>
       <w:r>
         <w:rPr>
@@ -253,7 +323,7 @@
     <w:p>
       <w:pPr>
         <w:spacing w:before="0" w:after="30" w:line="276" w:lineRule="auto"/>
-        <w:ind w:left="288"/>
+        <w:ind w:left="259"/>
       </w:pPr>
       <w:r>
         <w:rPr>
@@ -284,7 +354,7 @@
     <w:p>
       <w:pPr>
         <w:spacing w:before="0" w:after="30" w:line="276" w:lineRule="auto"/>
-        <w:ind w:left="288"/>
+        <w:ind w:left="259"/>
       </w:pPr>
       <w:r>
         <w:rPr>
@@ -315,7 +385,7 @@
     <w:p>
       <w:pPr>
         <w:spacing w:before="0" w:after="30" w:line="276" w:lineRule="auto"/>
-        <w:ind w:left="288"/>
+        <w:ind w:left="259"/>
       </w:pPr>
       <w:r>
         <w:rPr>
@@ -346,7 +416,7 @@
     <w:p>
       <w:pPr>
         <w:spacing w:before="0" w:after="30" w:line="276" w:lineRule="auto"/>
-        <w:ind w:left="288"/>
+        <w:ind w:left="259"/>
       </w:pPr>
       <w:r>
         <w:rPr>
@@ -390,15 +460,15 @@
           <w:tcPr>
             <w:tcW w:type="dxa" w:w="5234"/>
             <w:tcMar>
-              <w:top w:w="20" w:type="dxa"/>
-              <w:bottom w:w="10" w:type="dxa"/>
+              <w:top w:w="15" w:type="dxa"/>
+              <w:bottom w:w="8" w:type="dxa"/>
               <w:left w:w="0" w:type="dxa"/>
               <w:right w:w="0" w:type="dxa"/>
             </w:tcMar>
           </w:tcPr>
           <w:p>
             <w:pPr>
-              <w:spacing w:before="40" w:after="0" w:line="276" w:lineRule="auto"/>
+              <w:spacing w:before="30" w:after="0" w:line="276" w:lineRule="auto"/>
             </w:pPr>
             <w:r>
               <w:rPr>
@@ -424,15 +494,15 @@
           <w:tcPr>
             <w:tcW w:type="dxa" w:w="5234"/>
             <w:tcMar>
-              <w:top w:w="20" w:type="dxa"/>
-              <w:bottom w:w="10" w:type="dxa"/>
+              <w:top w:w="15" w:type="dxa"/>
+              <w:bottom w:w="8" w:type="dxa"/>
               <w:left w:w="0" w:type="dxa"/>
               <w:right w:w="0" w:type="dxa"/>
             </w:tcMar>
           </w:tcPr>
           <w:p>
             <w:pPr>
-              <w:spacing w:before="40" w:after="0" w:line="276" w:lineRule="auto"/>
+              <w:spacing w:before="30" w:after="0" w:line="276" w:lineRule="auto"/>
               <w:jc w:val="right"/>
             </w:pPr>
             <w:r>
@@ -465,7 +535,7 @@
     <w:p>
       <w:pPr>
         <w:spacing w:before="0" w:after="30" w:line="276" w:lineRule="auto"/>
-        <w:ind w:left="288"/>
+        <w:ind w:left="259"/>
       </w:pPr>
       <w:r>
         <w:rPr>
@@ -496,7 +566,7 @@
     <w:p>
       <w:pPr>
         <w:spacing w:before="0" w:after="30" w:line="276" w:lineRule="auto"/>
-        <w:ind w:left="288"/>
+        <w:ind w:left="259"/>
       </w:pPr>
       <w:r>
         <w:rPr>
@@ -527,7 +597,7 @@
     <w:p>
       <w:pPr>
         <w:spacing w:before="0" w:after="30" w:line="276" w:lineRule="auto"/>
-        <w:ind w:left="288"/>
+        <w:ind w:left="259"/>
       </w:pPr>
       <w:r>
         <w:rPr>
@@ -558,7 +628,7 @@
     <w:p>
       <w:pPr>
         <w:spacing w:before="0" w:after="30" w:line="276" w:lineRule="auto"/>
-        <w:ind w:left="288"/>
+        <w:ind w:left="259"/>
       </w:pPr>
       <w:r>
         <w:rPr>
@@ -602,15 +672,15 @@
           <w:tcPr>
             <w:tcW w:type="dxa" w:w="5234"/>
             <w:tcMar>
-              <w:top w:w="20" w:type="dxa"/>
-              <w:bottom w:w="10" w:type="dxa"/>
+              <w:top w:w="15" w:type="dxa"/>
+              <w:bottom w:w="8" w:type="dxa"/>
               <w:left w:w="0" w:type="dxa"/>
               <w:right w:w="0" w:type="dxa"/>
             </w:tcMar>
           </w:tcPr>
           <w:p>
             <w:pPr>
-              <w:spacing w:before="40" w:after="0" w:line="276" w:lineRule="auto"/>
+              <w:spacing w:before="30" w:after="0" w:line="276" w:lineRule="auto"/>
             </w:pPr>
             <w:r>
               <w:rPr>
@@ -636,15 +706,15 @@
           <w:tcPr>
             <w:tcW w:type="dxa" w:w="5234"/>
             <w:tcMar>
-              <w:top w:w="20" w:type="dxa"/>
-              <w:bottom w:w="10" w:type="dxa"/>
+              <w:top w:w="15" w:type="dxa"/>
+              <w:bottom w:w="8" w:type="dxa"/>
               <w:left w:w="0" w:type="dxa"/>
               <w:right w:w="0" w:type="dxa"/>
             </w:tcMar>
           </w:tcPr>
           <w:p>
             <w:pPr>
-              <w:spacing w:before="40" w:after="0" w:line="276" w:lineRule="auto"/>
+              <w:spacing w:before="30" w:after="0" w:line="276" w:lineRule="auto"/>
               <w:jc w:val="right"/>
             </w:pPr>
             <w:r>
@@ -677,7 +747,7 @@
     <w:p>
       <w:pPr>
         <w:spacing w:before="0" w:after="30" w:line="276" w:lineRule="auto"/>
-        <w:ind w:left="288"/>
+        <w:ind w:left="259"/>
       </w:pPr>
       <w:r>
         <w:rPr>
@@ -708,7 +778,7 @@
     <w:p>
       <w:pPr>
         <w:spacing w:before="0" w:after="30" w:line="276" w:lineRule="auto"/>
-        <w:ind w:left="288"/>
+        <w:ind w:left="259"/>
       </w:pPr>
       <w:r>
         <w:rPr>
@@ -739,7 +809,7 @@
     <w:p>
       <w:pPr>
         <w:spacing w:before="0" w:after="30" w:line="276" w:lineRule="auto"/>
-        <w:ind w:left="288"/>
+        <w:ind w:left="259"/>
       </w:pPr>
       <w:r>
         <w:rPr>
@@ -770,7 +840,7 @@
     <w:p>
       <w:pPr>
         <w:spacing w:before="0" w:after="30" w:line="276" w:lineRule="auto"/>
-        <w:ind w:left="288"/>
+        <w:ind w:left="259"/>
       </w:pPr>
       <w:r>
         <w:rPr>
@@ -801,7 +871,7 @@
     <w:p>
       <w:pPr>
         <w:spacing w:before="0" w:after="30" w:line="276" w:lineRule="auto"/>
-        <w:ind w:left="288"/>
+        <w:ind w:left="259"/>
       </w:pPr>
       <w:r>
         <w:rPr>
@@ -845,15 +915,15 @@
           <w:tcPr>
             <w:tcW w:type="dxa" w:w="5234"/>
             <w:tcMar>
-              <w:top w:w="20" w:type="dxa"/>
-              <w:bottom w:w="10" w:type="dxa"/>
+              <w:top w:w="15" w:type="dxa"/>
+              <w:bottom w:w="8" w:type="dxa"/>
               <w:left w:w="0" w:type="dxa"/>
               <w:right w:w="0" w:type="dxa"/>
             </w:tcMar>
           </w:tcPr>
           <w:p>
             <w:pPr>
-              <w:spacing w:before="40" w:after="0" w:line="276" w:lineRule="auto"/>
+              <w:spacing w:before="30" w:after="0" w:line="276" w:lineRule="auto"/>
             </w:pPr>
             <w:r>
               <w:rPr>
@@ -879,15 +949,15 @@
           <w:tcPr>
             <w:tcW w:type="dxa" w:w="5234"/>
             <w:tcMar>
-              <w:top w:w="20" w:type="dxa"/>
-              <w:bottom w:w="10" w:type="dxa"/>
+              <w:top w:w="15" w:type="dxa"/>
+              <w:bottom w:w="8" w:type="dxa"/>
               <w:left w:w="0" w:type="dxa"/>
               <w:right w:w="0" w:type="dxa"/>
             </w:tcMar>
           </w:tcPr>
           <w:p>
             <w:pPr>
-              <w:spacing w:before="40" w:after="0" w:line="276" w:lineRule="auto"/>
+              <w:spacing w:before="30" w:after="0" w:line="276" w:lineRule="auto"/>
               <w:jc w:val="right"/>
             </w:pPr>
             <w:r>
@@ -920,7 +990,7 @@
     <w:p>
       <w:pPr>
         <w:spacing w:before="0" w:after="30" w:line="276" w:lineRule="auto"/>
-        <w:ind w:left="288"/>
+        <w:ind w:left="259"/>
       </w:pPr>
       <w:r>
         <w:rPr>
@@ -951,7 +1021,7 @@
     <w:p>
       <w:pPr>
         <w:spacing w:before="0" w:after="30" w:line="276" w:lineRule="auto"/>
-        <w:ind w:left="288"/>
+        <w:ind w:left="259"/>
       </w:pPr>
       <w:r>
         <w:rPr>
@@ -982,7 +1052,7 @@
     <w:p>
       <w:pPr>
         <w:spacing w:before="0" w:after="30" w:line="276" w:lineRule="auto"/>
-        <w:ind w:left="288"/>
+        <w:ind w:left="259"/>
       </w:pPr>
       <w:r>
         <w:rPr>
@@ -1026,15 +1096,15 @@
           <w:tcPr>
             <w:tcW w:type="dxa" w:w="5234"/>
             <w:tcMar>
-              <w:top w:w="20" w:type="dxa"/>
-              <w:bottom w:w="10" w:type="dxa"/>
+              <w:top w:w="15" w:type="dxa"/>
+              <w:bottom w:w="8" w:type="dxa"/>
               <w:left w:w="0" w:type="dxa"/>
               <w:right w:w="0" w:type="dxa"/>
             </w:tcMar>
           </w:tcPr>
           <w:p>
             <w:pPr>
-              <w:spacing w:before="40" w:after="0" w:line="276" w:lineRule="auto"/>
+              <w:spacing w:before="30" w:after="0" w:line="276" w:lineRule="auto"/>
             </w:pPr>
             <w:r>
               <w:rPr>
@@ -1060,15 +1130,15 @@
           <w:tcPr>
             <w:tcW w:type="dxa" w:w="5234"/>
             <w:tcMar>
-              <w:top w:w="20" w:type="dxa"/>
-              <w:bottom w:w="10" w:type="dxa"/>
+              <w:top w:w="15" w:type="dxa"/>
+              <w:bottom w:w="8" w:type="dxa"/>
               <w:left w:w="0" w:type="dxa"/>
               <w:right w:w="0" w:type="dxa"/>
             </w:tcMar>
           </w:tcPr>
           <w:p>
             <w:pPr>
-              <w:spacing w:before="40" w:after="0" w:line="276" w:lineRule="auto"/>
+              <w:spacing w:before="30" w:after="0" w:line="276" w:lineRule="auto"/>
               <w:jc w:val="right"/>
             </w:pPr>
             <w:r>
@@ -1101,7 +1171,7 @@
     <w:p>
       <w:pPr>
         <w:spacing w:before="0" w:after="30" w:line="276" w:lineRule="auto"/>
-        <w:ind w:left="288"/>
+        <w:ind w:left="259"/>
       </w:pPr>
       <w:r>
         <w:rPr>
@@ -1132,7 +1202,7 @@
     <w:p>
       <w:pPr>
         <w:spacing w:before="0" w:after="30" w:line="276" w:lineRule="auto"/>
-        <w:ind w:left="288"/>
+        <w:ind w:left="259"/>
       </w:pPr>
       <w:r>
         <w:rPr>
@@ -1163,7 +1233,7 @@
     <w:p>
       <w:pPr>
         <w:keepNext/>
-        <w:spacing w:before="120" w:after="60"/>
+        <w:spacing w:before="100" w:after="50"/>
         <w:pBdr>
           <w:bottom w:val="single" w:sz="12" w:space="4" w:color="CBD5E1"/>
         </w:pBdr>
@@ -1194,15 +1264,15 @@
           <w:tcPr>
             <w:tcW w:type="dxa" w:w="5234"/>
             <w:tcMar>
-              <w:top w:w="20" w:type="dxa"/>
-              <w:bottom w:w="10" w:type="dxa"/>
+              <w:top w:w="15" w:type="dxa"/>
+              <w:bottom w:w="8" w:type="dxa"/>
               <w:left w:w="0" w:type="dxa"/>
               <w:right w:w="0" w:type="dxa"/>
             </w:tcMar>
           </w:tcPr>
           <w:p>
             <w:pPr>
-              <w:spacing w:before="40" w:after="0" w:line="276" w:lineRule="auto"/>
+              <w:spacing w:before="30" w:after="0" w:line="276" w:lineRule="auto"/>
             </w:pPr>
             <w:r>
               <w:rPr>
@@ -1228,15 +1298,15 @@
           <w:tcPr>
             <w:tcW w:type="dxa" w:w="5234"/>
             <w:tcMar>
-              <w:top w:w="20" w:type="dxa"/>
-              <w:bottom w:w="10" w:type="dxa"/>
+              <w:top w:w="15" w:type="dxa"/>
+              <w:bottom w:w="8" w:type="dxa"/>
               <w:left w:w="0" w:type="dxa"/>
               <w:right w:w="0" w:type="dxa"/>
             </w:tcMar>
           </w:tcPr>
           <w:p>
             <w:pPr>
-              <w:spacing w:before="40" w:after="0" w:line="276" w:lineRule="auto"/>
+              <w:spacing w:before="30" w:after="0" w:line="276" w:lineRule="auto"/>
               <w:jc w:val="right"/>
             </w:pPr>
             <w:r>
@@ -1255,7 +1325,7 @@
     <w:p>
       <w:pPr>
         <w:spacing w:before="0" w:after="30" w:line="276" w:lineRule="auto"/>
-        <w:ind w:left="288"/>
+        <w:ind w:left="259"/>
       </w:pPr>
       <w:r>
         <w:rPr>
@@ -1290,15 +1360,15 @@
           <w:tcPr>
             <w:tcW w:type="dxa" w:w="5234"/>
             <w:tcMar>
-              <w:top w:w="20" w:type="dxa"/>
-              <w:bottom w:w="10" w:type="dxa"/>
+              <w:top w:w="15" w:type="dxa"/>
+              <w:bottom w:w="8" w:type="dxa"/>
               <w:left w:w="0" w:type="dxa"/>
               <w:right w:w="0" w:type="dxa"/>
             </w:tcMar>
           </w:tcPr>
           <w:p>
             <w:pPr>
-              <w:spacing w:before="40" w:after="0" w:line="276" w:lineRule="auto"/>
+              <w:spacing w:before="30" w:after="0" w:line="276" w:lineRule="auto"/>
             </w:pPr>
             <w:r>
               <w:rPr>
@@ -1324,15 +1394,15 @@
           <w:tcPr>
             <w:tcW w:type="dxa" w:w="5234"/>
             <w:tcMar>
-              <w:top w:w="20" w:type="dxa"/>
-              <w:bottom w:w="10" w:type="dxa"/>
+              <w:top w:w="15" w:type="dxa"/>
+              <w:bottom w:w="8" w:type="dxa"/>
               <w:left w:w="0" w:type="dxa"/>
               <w:right w:w="0" w:type="dxa"/>
             </w:tcMar>
           </w:tcPr>
           <w:p>
             <w:pPr>
-              <w:spacing w:before="40" w:after="0" w:line="276" w:lineRule="auto"/>
+              <w:spacing w:before="30" w:after="0" w:line="276" w:lineRule="auto"/>
               <w:jc w:val="right"/>
             </w:pPr>
             <w:r>
@@ -1351,7 +1421,7 @@
     <w:p>
       <w:pPr>
         <w:spacing w:before="0" w:after="30" w:line="276" w:lineRule="auto"/>
-        <w:ind w:left="288"/>
+        <w:ind w:left="259"/>
       </w:pPr>
       <w:r>
         <w:rPr>
@@ -1386,15 +1456,15 @@
           <w:tcPr>
             <w:tcW w:type="dxa" w:w="5234"/>
             <w:tcMar>
-              <w:top w:w="20" w:type="dxa"/>
-              <w:bottom w:w="10" w:type="dxa"/>
+              <w:top w:w="15" w:type="dxa"/>
+              <w:bottom w:w="8" w:type="dxa"/>
               <w:left w:w="0" w:type="dxa"/>
               <w:right w:w="0" w:type="dxa"/>
             </w:tcMar>
           </w:tcPr>
           <w:p>
             <w:pPr>
-              <w:spacing w:before="40" w:after="0" w:line="276" w:lineRule="auto"/>
+              <w:spacing w:before="30" w:after="0" w:line="276" w:lineRule="auto"/>
             </w:pPr>
             <w:r>
               <w:rPr>
@@ -1420,15 +1490,15 @@
           <w:tcPr>
             <w:tcW w:type="dxa" w:w="5234"/>
             <w:tcMar>
-              <w:top w:w="20" w:type="dxa"/>
-              <w:bottom w:w="10" w:type="dxa"/>
+              <w:top w:w="15" w:type="dxa"/>
+              <w:bottom w:w="8" w:type="dxa"/>
               <w:left w:w="0" w:type="dxa"/>
               <w:right w:w="0" w:type="dxa"/>
             </w:tcMar>
           </w:tcPr>
           <w:p>
             <w:pPr>
-              <w:spacing w:before="40" w:after="0" w:line="276" w:lineRule="auto"/>
+              <w:spacing w:before="30" w:after="0" w:line="276" w:lineRule="auto"/>
               <w:jc w:val="right"/>
             </w:pPr>
             <w:r>
@@ -1447,7 +1517,7 @@
     <w:p>
       <w:pPr>
         <w:spacing w:before="0" w:after="30" w:line="276" w:lineRule="auto"/>
-        <w:ind w:left="288"/>
+        <w:ind w:left="259"/>
       </w:pPr>
       <w:r>
         <w:rPr>
@@ -1482,15 +1552,15 @@
           <w:tcPr>
             <w:tcW w:type="dxa" w:w="5234"/>
             <w:tcMar>
-              <w:top w:w="20" w:type="dxa"/>
-              <w:bottom w:w="10" w:type="dxa"/>
+              <w:top w:w="15" w:type="dxa"/>
+              <w:bottom w:w="8" w:type="dxa"/>
               <w:left w:w="0" w:type="dxa"/>
               <w:right w:w="0" w:type="dxa"/>
             </w:tcMar>
           </w:tcPr>
           <w:p>
             <w:pPr>
-              <w:spacing w:before="40" w:after="0" w:line="276" w:lineRule="auto"/>
+              <w:spacing w:before="30" w:after="0" w:line="276" w:lineRule="auto"/>
             </w:pPr>
             <w:r>
               <w:rPr>
@@ -1516,15 +1586,15 @@
           <w:tcPr>
             <w:tcW w:type="dxa" w:w="5234"/>
             <w:tcMar>
-              <w:top w:w="20" w:type="dxa"/>
-              <w:bottom w:w="10" w:type="dxa"/>
+              <w:top w:w="15" w:type="dxa"/>
+              <w:bottom w:w="8" w:type="dxa"/>
               <w:left w:w="0" w:type="dxa"/>
               <w:right w:w="0" w:type="dxa"/>
             </w:tcMar>
           </w:tcPr>
           <w:p>
             <w:pPr>
-              <w:spacing w:before="40" w:after="0" w:line="276" w:lineRule="auto"/>
+              <w:spacing w:before="30" w:after="0" w:line="276" w:lineRule="auto"/>
               <w:jc w:val="right"/>
             </w:pPr>
             <w:r>
@@ -1543,7 +1613,7 @@
     <w:p>
       <w:pPr>
         <w:spacing w:before="0" w:after="30" w:line="276" w:lineRule="auto"/>
-        <w:ind w:left="288"/>
+        <w:ind w:left="259"/>
       </w:pPr>
       <w:r>
         <w:rPr>
@@ -1578,15 +1648,15 @@
           <w:tcPr>
             <w:tcW w:type="dxa" w:w="5234"/>
             <w:tcMar>
-              <w:top w:w="20" w:type="dxa"/>
-              <w:bottom w:w="10" w:type="dxa"/>
+              <w:top w:w="15" w:type="dxa"/>
+              <w:bottom w:w="8" w:type="dxa"/>
               <w:left w:w="0" w:type="dxa"/>
               <w:right w:w="0" w:type="dxa"/>
             </w:tcMar>
           </w:tcPr>
           <w:p>
             <w:pPr>
-              <w:spacing w:before="40" w:after="0" w:line="276" w:lineRule="auto"/>
+              <w:spacing w:before="30" w:after="0" w:line="276" w:lineRule="auto"/>
             </w:pPr>
             <w:r>
               <w:rPr>
@@ -1612,15 +1682,15 @@
           <w:tcPr>
             <w:tcW w:type="dxa" w:w="5234"/>
             <w:tcMar>
-              <w:top w:w="20" w:type="dxa"/>
-              <w:bottom w:w="10" w:type="dxa"/>
+              <w:top w:w="15" w:type="dxa"/>
+              <w:bottom w:w="8" w:type="dxa"/>
               <w:left w:w="0" w:type="dxa"/>
               <w:right w:w="0" w:type="dxa"/>
             </w:tcMar>
           </w:tcPr>
           <w:p>
             <w:pPr>
-              <w:spacing w:before="40" w:after="0" w:line="276" w:lineRule="auto"/>
+              <w:spacing w:before="30" w:after="0" w:line="276" w:lineRule="auto"/>
               <w:jc w:val="right"/>
             </w:pPr>
             <w:r>
@@ -1639,7 +1709,7 @@
     <w:p>
       <w:pPr>
         <w:spacing w:before="0" w:after="30" w:line="276" w:lineRule="auto"/>
-        <w:ind w:left="288"/>
+        <w:ind w:left="259"/>
       </w:pPr>
       <w:r>
         <w:rPr>
@@ -1661,7 +1731,7 @@
     <w:p>
       <w:pPr>
         <w:keepNext/>
-        <w:spacing w:before="120" w:after="60"/>
+        <w:spacing w:before="100" w:after="50"/>
         <w:pBdr>
           <w:bottom w:val="single" w:sz="12" w:space="4" w:color="CBD5E1"/>
         </w:pBdr>
@@ -1692,8 +1762,8 @@
           <w:tcPr>
             <w:tcW w:type="dxa" w:w="5234"/>
             <w:tcMar>
-              <w:top w:w="15" w:type="dxa"/>
-              <w:bottom w:w="15" w:type="dxa"/>
+              <w:top w:w="12" w:type="dxa"/>
+              <w:bottom w:w="12" w:type="dxa"/>
               <w:left w:w="0" w:type="dxa"/>
               <w:right w:w="0" w:type="dxa"/>
             </w:tcMar>
@@ -1717,8 +1787,8 @@
           <w:tcPr>
             <w:tcW w:type="dxa" w:w="5234"/>
             <w:tcMar>
-              <w:top w:w="15" w:type="dxa"/>
-              <w:bottom w:w="15" w:type="dxa"/>
+              <w:top w:w="12" w:type="dxa"/>
+              <w:bottom w:w="12" w:type="dxa"/>
               <w:left w:w="0" w:type="dxa"/>
               <w:right w:w="0" w:type="dxa"/>
             </w:tcMar>
@@ -1743,8 +1813,8 @@
           <w:tcPr>
             <w:tcW w:type="dxa" w:w="5234"/>
             <w:tcMar>
-              <w:top w:w="15" w:type="dxa"/>
-              <w:bottom w:w="15" w:type="dxa"/>
+              <w:top w:w="12" w:type="dxa"/>
+              <w:bottom w:w="12" w:type="dxa"/>
               <w:left w:w="0" w:type="dxa"/>
               <w:right w:w="0" w:type="dxa"/>
             </w:tcMar>
@@ -1768,8 +1838,8 @@
           <w:tcPr>
             <w:tcW w:type="dxa" w:w="5234"/>
             <w:tcMar>
-              <w:top w:w="15" w:type="dxa"/>
-              <w:bottom w:w="15" w:type="dxa"/>
+              <w:top w:w="12" w:type="dxa"/>
+              <w:bottom w:w="12" w:type="dxa"/>
               <w:left w:w="0" w:type="dxa"/>
               <w:right w:w="0" w:type="dxa"/>
             </w:tcMar>
@@ -1794,8 +1864,8 @@
           <w:tcPr>
             <w:tcW w:type="dxa" w:w="5234"/>
             <w:tcMar>
-              <w:top w:w="15" w:type="dxa"/>
-              <w:bottom w:w="15" w:type="dxa"/>
+              <w:top w:w="12" w:type="dxa"/>
+              <w:bottom w:w="12" w:type="dxa"/>
               <w:left w:w="0" w:type="dxa"/>
               <w:right w:w="0" w:type="dxa"/>
             </w:tcMar>
@@ -1819,8 +1889,8 @@
           <w:tcPr>
             <w:tcW w:type="dxa" w:w="5234"/>
             <w:tcMar>
-              <w:top w:w="15" w:type="dxa"/>
-              <w:bottom w:w="15" w:type="dxa"/>
+              <w:top w:w="12" w:type="dxa"/>
+              <w:bottom w:w="12" w:type="dxa"/>
               <w:left w:w="0" w:type="dxa"/>
               <w:right w:w="0" w:type="dxa"/>
             </w:tcMar>
@@ -1845,8 +1915,8 @@
           <w:tcPr>
             <w:tcW w:type="dxa" w:w="5234"/>
             <w:tcMar>
-              <w:top w:w="15" w:type="dxa"/>
-              <w:bottom w:w="15" w:type="dxa"/>
+              <w:top w:w="12" w:type="dxa"/>
+              <w:bottom w:w="12" w:type="dxa"/>
               <w:left w:w="0" w:type="dxa"/>
               <w:right w:w="0" w:type="dxa"/>
             </w:tcMar>
@@ -1870,8 +1940,8 @@
           <w:tcPr>
             <w:tcW w:type="dxa" w:w="5234"/>
             <w:tcMar>
-              <w:top w:w="15" w:type="dxa"/>
-              <w:bottom w:w="15" w:type="dxa"/>
+              <w:top w:w="12" w:type="dxa"/>
+              <w:bottom w:w="12" w:type="dxa"/>
               <w:left w:w="0" w:type="dxa"/>
               <w:right w:w="0" w:type="dxa"/>
             </w:tcMar>
@@ -1896,8 +1966,8 @@
           <w:tcPr>
             <w:tcW w:type="dxa" w:w="5234"/>
             <w:tcMar>
-              <w:top w:w="15" w:type="dxa"/>
-              <w:bottom w:w="15" w:type="dxa"/>
+              <w:top w:w="12" w:type="dxa"/>
+              <w:bottom w:w="12" w:type="dxa"/>
               <w:left w:w="0" w:type="dxa"/>
               <w:right w:w="0" w:type="dxa"/>
             </w:tcMar>
@@ -1921,8 +1991,8 @@
           <w:tcPr>
             <w:tcW w:type="dxa" w:w="5234"/>
             <w:tcMar>
-              <w:top w:w="15" w:type="dxa"/>
-              <w:bottom w:w="15" w:type="dxa"/>
+              <w:top w:w="12" w:type="dxa"/>
+              <w:bottom w:w="12" w:type="dxa"/>
               <w:left w:w="0" w:type="dxa"/>
               <w:right w:w="0" w:type="dxa"/>
             </w:tcMar>
@@ -1946,7 +2016,7 @@
     <w:p>
       <w:pPr>
         <w:keepNext/>
-        <w:spacing w:before="120" w:after="60"/>
+        <w:spacing w:before="100" w:after="50"/>
         <w:pBdr>
           <w:bottom w:val="single" w:sz="12" w:space="4" w:color="CBD5E1"/>
         </w:pBdr>
@@ -1977,15 +2047,15 @@
           <w:tcPr>
             <w:tcW w:type="dxa" w:w="5234"/>
             <w:tcMar>
-              <w:top w:w="20" w:type="dxa"/>
-              <w:bottom w:w="10" w:type="dxa"/>
+              <w:top w:w="15" w:type="dxa"/>
+              <w:bottom w:w="8" w:type="dxa"/>
               <w:left w:w="0" w:type="dxa"/>
               <w:right w:w="0" w:type="dxa"/>
             </w:tcMar>
           </w:tcPr>
           <w:p>
             <w:pPr>
-              <w:spacing w:before="40" w:after="0" w:line="276" w:lineRule="auto"/>
+              <w:spacing w:before="30" w:after="0" w:line="276" w:lineRule="auto"/>
             </w:pPr>
             <w:r>
               <w:rPr>
@@ -2011,15 +2081,15 @@
           <w:tcPr>
             <w:tcW w:type="dxa" w:w="5234"/>
             <w:tcMar>
-              <w:top w:w="20" w:type="dxa"/>
-              <w:bottom w:w="10" w:type="dxa"/>
+              <w:top w:w="15" w:type="dxa"/>
+              <w:bottom w:w="8" w:type="dxa"/>
               <w:left w:w="0" w:type="dxa"/>
               <w:right w:w="0" w:type="dxa"/>
             </w:tcMar>
           </w:tcPr>
           <w:p>
             <w:pPr>
-              <w:spacing w:before="40" w:after="0" w:line="276" w:lineRule="auto"/>
+              <w:spacing w:before="30" w:after="0" w:line="276" w:lineRule="auto"/>
               <w:jc w:val="right"/>
             </w:pPr>
             <w:r>
@@ -2052,7 +2122,7 @@
     <w:p>
       <w:pPr>
         <w:spacing w:before="0" w:after="30" w:line="276" w:lineRule="auto"/>
-        <w:ind w:left="288"/>
+        <w:ind w:left="259"/>
       </w:pPr>
       <w:r>
         <w:rPr>
@@ -2083,7 +2153,7 @@
     <w:p>
       <w:pPr>
         <w:spacing w:before="0" w:after="30" w:line="276" w:lineRule="auto"/>
-        <w:ind w:left="288"/>
+        <w:ind w:left="259"/>
       </w:pPr>
       <w:r>
         <w:rPr>
@@ -2127,15 +2197,15 @@
           <w:tcPr>
             <w:tcW w:type="dxa" w:w="5234"/>
             <w:tcMar>
-              <w:top w:w="20" w:type="dxa"/>
-              <w:bottom w:w="10" w:type="dxa"/>
+              <w:top w:w="15" w:type="dxa"/>
+              <w:bottom w:w="8" w:type="dxa"/>
               <w:left w:w="0" w:type="dxa"/>
               <w:right w:w="0" w:type="dxa"/>
             </w:tcMar>
           </w:tcPr>
           <w:p>
             <w:pPr>
-              <w:spacing w:before="40" w:after="0" w:line="276" w:lineRule="auto"/>
+              <w:spacing w:before="30" w:after="0" w:line="276" w:lineRule="auto"/>
             </w:pPr>
             <w:r>
               <w:rPr>
@@ -2161,15 +2231,15 @@
           <w:tcPr>
             <w:tcW w:type="dxa" w:w="5234"/>
             <w:tcMar>
-              <w:top w:w="20" w:type="dxa"/>
-              <w:bottom w:w="10" w:type="dxa"/>
+              <w:top w:w="15" w:type="dxa"/>
+              <w:bottom w:w="8" w:type="dxa"/>
               <w:left w:w="0" w:type="dxa"/>
               <w:right w:w="0" w:type="dxa"/>
             </w:tcMar>
           </w:tcPr>
           <w:p>
             <w:pPr>
-              <w:spacing w:before="40" w:after="0" w:line="276" w:lineRule="auto"/>
+              <w:spacing w:before="30" w:after="0" w:line="276" w:lineRule="auto"/>
               <w:jc w:val="right"/>
             </w:pPr>
             <w:r>
@@ -2202,7 +2272,7 @@
     <w:p>
       <w:pPr>
         <w:spacing w:before="0" w:after="30" w:line="276" w:lineRule="auto"/>
-        <w:ind w:left="288"/>
+        <w:ind w:left="259"/>
       </w:pPr>
       <w:r>
         <w:rPr>
@@ -2233,7 +2303,7 @@
     <w:p>
       <w:pPr>
         <w:spacing w:before="0" w:after="30" w:line="276" w:lineRule="auto"/>
-        <w:ind w:left="288"/>
+        <w:ind w:left="259"/>
       </w:pPr>
       <w:r>
         <w:rPr>
@@ -2264,7 +2334,7 @@
     <w:p>
       <w:pPr>
         <w:spacing w:before="0" w:after="30" w:line="276" w:lineRule="auto"/>
-        <w:ind w:left="288"/>
+        <w:ind w:left="259"/>
       </w:pPr>
       <w:r>
         <w:rPr>
@@ -2295,7 +2365,7 @@
     <w:p>
       <w:pPr>
         <w:spacing w:before="0" w:after="30" w:line="276" w:lineRule="auto"/>
-        <w:ind w:left="288"/>
+        <w:ind w:left="259"/>
       </w:pPr>
       <w:r>
         <w:rPr>
@@ -2326,7 +2396,7 @@
     <w:p>
       <w:pPr>
         <w:keepNext/>
-        <w:spacing w:before="120" w:after="60"/>
+        <w:spacing w:before="100" w:after="50"/>
         <w:pBdr>
           <w:bottom w:val="single" w:sz="12" w:space="4" w:color="CBD5E1"/>
         </w:pBdr>
@@ -2378,7 +2448,7 @@
     </w:p>
     <w:sectPr>
       <w:pgSz w:w="11909" w:h="16834"/>
-      <w:pgMar w:top="648" w:right="720" w:bottom="648" w:left="720" w:header="720" w:footer="720" w:gutter="0"/>
+      <w:pgMar w:top="605" w:right="720" w:bottom="605" w:left="720" w:header="720" w:footer="720" w:gutter="0"/>
       <w:cols w:space="720"/>
       <w:docGrid w:linePitch="360"/>
     </w:sectPr>

</xml_diff>